<commit_message>
docs: update platform design document (#5)
</commit_message>
<xml_diff>
--- a/docs/ecu_test_intelligence_platform_design.docx
+++ b/docs/ecu_test_intelligence_platform_design.docx
@@ -215,7 +215,7 @@
           <w:sz w:val="21"/>
           <w:szCs w:val="21"/>
         </w:rPr>
-        <w:t xml:space="preserve">In automotive HIL and SDV validation environments (such as the GM SDV2 project at KPIT), the following pain points exist:</w:t>
+        <w:t xml:space="preserve">In automotive HIL and SDV validation environments, the following pain points exist:</w:t>
       </w:r>
     </w:p>
     <w:p>
@@ -593,7 +593,7 @@
                 <w:sz w:val="20"/>
                 <w:szCs w:val="20"/>
               </w:rPr>
-              <w:t xml:space="preserve">LLM agent reads ECU spec PDFs and generates MTF-format test cases</w:t>
+              <w:t xml:space="preserve">LLM agent reads ECU spec PDFs and generates automotive YAML test cases</w:t>
             </w:r>
           </w:p>
         </w:tc>
@@ -1845,7 +1845,7 @@
                 <w:sz w:val="20"/>
                 <w:szCs w:val="20"/>
               </w:rPr>
-              <w:t xml:space="preserve">MTF-format test output</w:t>
+              <w:t xml:space="preserve">automotive YAML-format test output</w:t>
             </w:r>
           </w:p>
         </w:tc>
@@ -1874,7 +1874,7 @@
                 <w:sz w:val="20"/>
                 <w:szCs w:val="20"/>
               </w:rPr>
-              <w:t xml:space="preserve">AI-generated test cases in MTF-compatible YAML format</w:t>
+              <w:t xml:space="preserve">AI-generated test cases in automotive YAML format</w:t>
             </w:r>
           </w:p>
         </w:tc>
@@ -1903,7 +1903,7 @@
                 <w:sz w:val="20"/>
                 <w:szCs w:val="20"/>
               </w:rPr>
-              <w:t xml:space="preserve">TE MTF</w:t>
+              <w:t xml:space="preserve">Automotive Test Framework</w:t>
             </w:r>
           </w:p>
         </w:tc>
@@ -3099,7 +3099,7 @@
                 <w:sz w:val="20"/>
                 <w:szCs w:val="20"/>
               </w:rPr>
-              <w:t xml:space="preserve">Python, pytest, MTF-format YAML</w:t>
+              <w:t xml:space="preserve">Python, pytest, automotive YAML</w:t>
             </w:r>
           </w:p>
         </w:tc>
@@ -3337,7 +3337,7 @@
                 <w:sz w:val="20"/>
                 <w:szCs w:val="20"/>
               </w:rPr>
-              <w:t xml:space="preserve">Reads ECU spec PDF; generates new MTF-format test cases via LLM</w:t>
+              <w:t xml:space="preserve">Reads ECU spec PDF; generates new automotive YAML test cases via LLM</w:t>
             </w:r>
           </w:p>
         </w:tc>
@@ -5285,7 +5285,7 @@
                 <w:sz w:val="20"/>
                 <w:szCs w:val="20"/>
               </w:rPr>
-              <w:t xml:space="preserve">Parses MTF-compatible YAML test case definitions</w:t>
+              <w:t xml:space="preserve">Parses automotive YAML test case definitions</w:t>
             </w:r>
           </w:p>
         </w:tc>
@@ -6354,7 +6354,7 @@
           <w:sz w:val="21"/>
           <w:szCs w:val="21"/>
         </w:rPr>
-        <w:t xml:space="preserve">Reads an ECU specification PDF (UDS or OBD-II spec document), chunks it into sections, embeds into ChromaDB, and uses an LLM to generate new test cases in MTF-compatible YAML format. Generated test cases are committed back to the repo via a GitHub Actions step.</w:t>
+        <w:t xml:space="preserve">Reads an ECU specification PDF (UDS or OBD-II spec document), chunks it into sections, embeds into ChromaDB, and uses an LLM to generate new test cases in automotive YAML format. Generated test cases are committed back to the repo via a GitHub Actions step.</w:t>
       </w:r>
     </w:p>
     <w:p>
@@ -6680,7 +6680,7 @@
                 <w:sz w:val="20"/>
                 <w:szCs w:val="20"/>
               </w:rPr>
-              <w:t xml:space="preserve">Validates generated YAML against MTF test case schema before committing</w:t>
+              <w:t xml:space="preserve">Validates generated YAML against automotive test case schema before committing</w:t>
             </w:r>
           </w:p>
         </w:tc>
@@ -8410,7 +8410,7 @@
                 <w:sz w:val="20"/>
                 <w:szCs w:val="20"/>
               </w:rPr>
-              <w:t xml:space="preserve">MTF-format YAML test case definitions</w:t>
+              <w:t xml:space="preserve">automotive YAML test case definitions</w:t>
             </w:r>
           </w:p>
         </w:tc>
@@ -9310,7 +9310,7 @@
                 <w:sz w:val="20"/>
                 <w:szCs w:val="20"/>
               </w:rPr>
-              <w:t xml:space="preserve">MTF schema validator</w:t>
+              <w:t xml:space="preserve">automotive test case schema validator</w:t>
             </w:r>
           </w:p>
         </w:tc>
@@ -10920,7 +10920,7 @@
                 <w:sz w:val="20"/>
                 <w:szCs w:val="20"/>
               </w:rPr>
-              <w:t xml:space="preserve">Define MTF-compatible schema: service_id, expected_response, tolerance</w:t>
+              <w:t xml:space="preserve">Define automotive YAML-compatible schema: service_id, expected_response, tolerance</w:t>
             </w:r>
           </w:p>
         </w:tc>
@@ -12847,7 +12847,7 @@
                 <w:sz w:val="20"/>
                 <w:szCs w:val="20"/>
               </w:rPr>
-              <w:t xml:space="preserve">Validate against MTF schema, reject malformed output</w:t>
+              <w:t xml:space="preserve">Validate against automotive test case schema, reject malformed output</w:t>
             </w:r>
           </w:p>
         </w:tc>
@@ -14664,7 +14664,7 @@
           <w:sz w:val="21"/>
           <w:szCs w:val="21"/>
         </w:rPr>
-        <w:t xml:space="preserve">Built an LLM-powered test case generator that parses ECU specification PDFs and produces MTF-compatible YAML test cases via a RAG pipeline</w:t>
+        <w:t xml:space="preserve">Built an LLM-powered test case generator that parses ECU specification PDFs and produces automotive YAML test cases via a RAG pipeline</w:t>
       </w:r>
     </w:p>
     <w:p>

</xml_diff>

<commit_message>
docs: update platform design document (#5) (#6)
* docs: update README with project architecture and features (#3)

* docs: update platform design document (#5)
</commit_message>
<xml_diff>
--- a/docs/ecu_test_intelligence_platform_design.docx
+++ b/docs/ecu_test_intelligence_platform_design.docx
@@ -215,7 +215,7 @@
           <w:sz w:val="21"/>
           <w:szCs w:val="21"/>
         </w:rPr>
-        <w:t xml:space="preserve">In automotive HIL and SDV validation environments (such as the GM SDV2 project at KPIT), the following pain points exist:</w:t>
+        <w:t xml:space="preserve">In automotive HIL and SDV validation environments, the following pain points exist:</w:t>
       </w:r>
     </w:p>
     <w:p>
@@ -593,7 +593,7 @@
                 <w:sz w:val="20"/>
                 <w:szCs w:val="20"/>
               </w:rPr>
-              <w:t xml:space="preserve">LLM agent reads ECU spec PDFs and generates MTF-format test cases</w:t>
+              <w:t xml:space="preserve">LLM agent reads ECU spec PDFs and generates automotive YAML test cases</w:t>
             </w:r>
           </w:p>
         </w:tc>
@@ -1845,7 +1845,7 @@
                 <w:sz w:val="20"/>
                 <w:szCs w:val="20"/>
               </w:rPr>
-              <w:t xml:space="preserve">MTF-format test output</w:t>
+              <w:t xml:space="preserve">automotive YAML-format test output</w:t>
             </w:r>
           </w:p>
         </w:tc>
@@ -1874,7 +1874,7 @@
                 <w:sz w:val="20"/>
                 <w:szCs w:val="20"/>
               </w:rPr>
-              <w:t xml:space="preserve">AI-generated test cases in MTF-compatible YAML format</w:t>
+              <w:t xml:space="preserve">AI-generated test cases in automotive YAML format</w:t>
             </w:r>
           </w:p>
         </w:tc>
@@ -1903,7 +1903,7 @@
                 <w:sz w:val="20"/>
                 <w:szCs w:val="20"/>
               </w:rPr>
-              <w:t xml:space="preserve">TE MTF</w:t>
+              <w:t xml:space="preserve">Automotive Test Framework</w:t>
             </w:r>
           </w:p>
         </w:tc>
@@ -3099,7 +3099,7 @@
                 <w:sz w:val="20"/>
                 <w:szCs w:val="20"/>
               </w:rPr>
-              <w:t xml:space="preserve">Python, pytest, MTF-format YAML</w:t>
+              <w:t xml:space="preserve">Python, pytest, automotive YAML</w:t>
             </w:r>
           </w:p>
         </w:tc>
@@ -3337,7 +3337,7 @@
                 <w:sz w:val="20"/>
                 <w:szCs w:val="20"/>
               </w:rPr>
-              <w:t xml:space="preserve">Reads ECU spec PDF; generates new MTF-format test cases via LLM</w:t>
+              <w:t xml:space="preserve">Reads ECU spec PDF; generates new automotive YAML test cases via LLM</w:t>
             </w:r>
           </w:p>
         </w:tc>
@@ -5285,7 +5285,7 @@
                 <w:sz w:val="20"/>
                 <w:szCs w:val="20"/>
               </w:rPr>
-              <w:t xml:space="preserve">Parses MTF-compatible YAML test case definitions</w:t>
+              <w:t xml:space="preserve">Parses automotive YAML test case definitions</w:t>
             </w:r>
           </w:p>
         </w:tc>
@@ -6354,7 +6354,7 @@
           <w:sz w:val="21"/>
           <w:szCs w:val="21"/>
         </w:rPr>
-        <w:t xml:space="preserve">Reads an ECU specification PDF (UDS or OBD-II spec document), chunks it into sections, embeds into ChromaDB, and uses an LLM to generate new test cases in MTF-compatible YAML format. Generated test cases are committed back to the repo via a GitHub Actions step.</w:t>
+        <w:t xml:space="preserve">Reads an ECU specification PDF (UDS or OBD-II spec document), chunks it into sections, embeds into ChromaDB, and uses an LLM to generate new test cases in automotive YAML format. Generated test cases are committed back to the repo via a GitHub Actions step.</w:t>
       </w:r>
     </w:p>
     <w:p>
@@ -6680,7 +6680,7 @@
                 <w:sz w:val="20"/>
                 <w:szCs w:val="20"/>
               </w:rPr>
-              <w:t xml:space="preserve">Validates generated YAML against MTF test case schema before committing</w:t>
+              <w:t xml:space="preserve">Validates generated YAML against automotive test case schema before committing</w:t>
             </w:r>
           </w:p>
         </w:tc>
@@ -8410,7 +8410,7 @@
                 <w:sz w:val="20"/>
                 <w:szCs w:val="20"/>
               </w:rPr>
-              <w:t xml:space="preserve">MTF-format YAML test case definitions</w:t>
+              <w:t xml:space="preserve">automotive YAML test case definitions</w:t>
             </w:r>
           </w:p>
         </w:tc>
@@ -9310,7 +9310,7 @@
                 <w:sz w:val="20"/>
                 <w:szCs w:val="20"/>
               </w:rPr>
-              <w:t xml:space="preserve">MTF schema validator</w:t>
+              <w:t xml:space="preserve">automotive test case schema validator</w:t>
             </w:r>
           </w:p>
         </w:tc>
@@ -10920,7 +10920,7 @@
                 <w:sz w:val="20"/>
                 <w:szCs w:val="20"/>
               </w:rPr>
-              <w:t xml:space="preserve">Define MTF-compatible schema: service_id, expected_response, tolerance</w:t>
+              <w:t xml:space="preserve">Define automotive YAML-compatible schema: service_id, expected_response, tolerance</w:t>
             </w:r>
           </w:p>
         </w:tc>
@@ -12847,7 +12847,7 @@
                 <w:sz w:val="20"/>
                 <w:szCs w:val="20"/>
               </w:rPr>
-              <w:t xml:space="preserve">Validate against MTF schema, reject malformed output</w:t>
+              <w:t xml:space="preserve">Validate against automotive test case schema, reject malformed output</w:t>
             </w:r>
           </w:p>
         </w:tc>
@@ -14664,7 +14664,7 @@
           <w:sz w:val="21"/>
           <w:szCs w:val="21"/>
         </w:rPr>
-        <w:t xml:space="preserve">Built an LLM-powered test case generator that parses ECU specification PDFs and produces MTF-compatible YAML test cases via a RAG pipeline</w:t>
+        <w:t xml:space="preserve">Built an LLM-powered test case generator that parses ECU specification PDFs and produces automotive YAML test cases via a RAG pipeline</w:t>
       </w:r>
     </w:p>
     <w:p>

</xml_diff>